<commit_message>
Updated AVCDL roles and responsibilities spreadsheet (corrected phase gate requirements column fill color) / Updated AVCDL primary document (replace primary R usage with A in RACI summaries)
</commit_message>
<xml_diff>
--- a/source/primary_document/AVCDL.docx
+++ b/source/primary_document/AVCDL.docx
@@ -83,7 +83,7 @@
           <w:rFonts w:cs="Arial"/>
           <w:szCs w:val="22"/>
         </w:rPr>
-        <w:t>7</w:t>
+        <w:t>8</w:t>
       </w:r>
     </w:p>
     <w:p>
@@ -120,7 +120,7 @@
           <w:noProof/>
           <w:szCs w:val="22"/>
         </w:rPr>
-        <w:t>5/7/26 11:40 AM</w:t>
+        <w:t>5/8/26 8:17 AM</w:t>
       </w:r>
       <w:r>
         <w:rPr>
@@ -18267,7 +18267,7 @@
     </w:p>
     <w:p>
       <w:r>
-        <w:pict w14:anchorId="1E426236">
+        <w:pict w14:anchorId="46CD391F">
           <v:rect id="Horizontal Line 1" o:spid="_x0000_s1034" alt="" style="width:468pt;height:.05pt;visibility:visible;mso-wrap-style:square;mso-width-percent:0;mso-height-percent:0;mso-left-percent:-10001;mso-top-percent:-10001;mso-position-horizontal:absolute;mso-position-horizontal-relative:char;mso-position-vertical:absolute;mso-position-vertical-relative:line;mso-width-percent:0;mso-height-percent:0;mso-left-percent:-10001;mso-top-percent:-10001;v-text-anchor:top" filled="f">
             <o:lock v:ext="edit" rotation="t" aspectratio="t" verticies="t" text="t" shapetype="t"/>
             <w10:anchorlock/>
@@ -19141,7 +19141,7 @@
               <w:jc w:val="center"/>
             </w:pPr>
             <w:r>
-              <w:t>R</w:t>
+              <w:t>A</w:t>
             </w:r>
           </w:p>
         </w:tc>
@@ -19866,7 +19866,7 @@
               <w:jc w:val="center"/>
             </w:pPr>
             <w:r>
-              <w:t>R</w:t>
+              <w:t>A</w:t>
             </w:r>
           </w:p>
         </w:tc>
@@ -20394,7 +20394,7 @@
               <w:jc w:val="center"/>
             </w:pPr>
             <w:r>
-              <w:t>R</w:t>
+              <w:t>A</w:t>
             </w:r>
           </w:p>
         </w:tc>
@@ -21088,7 +21088,7 @@
               <w:jc w:val="center"/>
             </w:pPr>
             <w:r>
-              <w:t>R</w:t>
+              <w:t>A</w:t>
             </w:r>
           </w:p>
         </w:tc>
@@ -21587,7 +21587,7 @@
               <w:jc w:val="center"/>
             </w:pPr>
             <w:r>
-              <w:t>R</w:t>
+              <w:t>A</w:t>
             </w:r>
           </w:p>
         </w:tc>
@@ -22171,7 +22171,7 @@
               <w:jc w:val="center"/>
             </w:pPr>
             <w:r>
-              <w:t>R</w:t>
+              <w:t>A</w:t>
             </w:r>
           </w:p>
         </w:tc>
@@ -22744,7 +22744,7 @@
               <w:jc w:val="center"/>
             </w:pPr>
             <w:r>
-              <w:t>R</w:t>
+              <w:t>A</w:t>
             </w:r>
           </w:p>
         </w:tc>
@@ -23486,7 +23486,7 @@
               <w:jc w:val="center"/>
             </w:pPr>
             <w:r>
-              <w:t>R</w:t>
+              <w:t>A</w:t>
             </w:r>
           </w:p>
         </w:tc>
@@ -24055,7 +24055,7 @@
               <w:jc w:val="center"/>
             </w:pPr>
             <w:r>
-              <w:t>R</w:t>
+              <w:t>A</w:t>
             </w:r>
           </w:p>
         </w:tc>
@@ -24524,7 +24524,7 @@
               <w:jc w:val="center"/>
             </w:pPr>
             <w:r>
-              <w:t>R</w:t>
+              <w:t>A</w:t>
             </w:r>
           </w:p>
         </w:tc>
@@ -24969,7 +24969,7 @@
     </w:p>
     <w:p>
       <w:r>
-        <w:pict w14:anchorId="6120EB9C">
+        <w:pict w14:anchorId="2E2784BE">
           <v:rect id="Horizontal Line 2" o:spid="_x0000_s1033" alt="" style="width:468pt;height:.05pt;visibility:visible;mso-wrap-style:square;mso-width-percent:0;mso-height-percent:0;mso-left-percent:-10001;mso-top-percent:-10001;mso-position-horizontal:absolute;mso-position-horizontal-relative:char;mso-position-vertical:absolute;mso-position-vertical-relative:line;mso-width-percent:0;mso-height-percent:0;mso-left-percent:-10001;mso-top-percent:-10001;v-text-anchor:top" filled="f">
             <o:lock v:ext="edit" rotation="t" aspectratio="t" verticies="t" text="t" shapetype="t"/>
             <w10:anchorlock/>
@@ -25398,7 +25398,7 @@
               <w:jc w:val="center"/>
             </w:pPr>
             <w:r>
-              <w:t>R</w:t>
+              <w:t>A</w:t>
             </w:r>
           </w:p>
         </w:tc>
@@ -26039,7 +26039,7 @@
               <w:jc w:val="center"/>
             </w:pPr>
             <w:r>
-              <w:t>R</w:t>
+              <w:t>A</w:t>
             </w:r>
           </w:p>
         </w:tc>
@@ -26250,7 +26250,7 @@
     </w:p>
     <w:p>
       <w:r>
-        <w:pict w14:anchorId="15DEC18C">
+        <w:pict w14:anchorId="75816764">
           <v:rect id="Horizontal Line 3" o:spid="_x0000_s1032" alt="" style="width:468pt;height:.05pt;visibility:visible;mso-wrap-style:square;mso-width-percent:0;mso-height-percent:0;mso-left-percent:-10001;mso-top-percent:-10001;mso-position-horizontal:absolute;mso-position-horizontal-relative:char;mso-position-vertical:absolute;mso-position-vertical-relative:line;mso-width-percent:0;mso-height-percent:0;mso-left-percent:-10001;mso-top-percent:-10001;v-text-anchor:top" filled="f">
             <o:lock v:ext="edit" rotation="t" aspectratio="t" verticies="t" text="t" shapetype="t"/>
             <w10:anchorlock/>
@@ -26835,7 +26835,7 @@
               <w:jc w:val="center"/>
             </w:pPr>
             <w:r>
-              <w:t>R</w:t>
+              <w:t>A</w:t>
             </w:r>
           </w:p>
         </w:tc>
@@ -27314,7 +27314,7 @@
               <w:jc w:val="center"/>
             </w:pPr>
             <w:r>
-              <w:t>R</w:t>
+              <w:t>A</w:t>
             </w:r>
           </w:p>
         </w:tc>
@@ -27850,7 +27850,7 @@
               <w:jc w:val="center"/>
             </w:pPr>
             <w:r>
-              <w:t>R</w:t>
+              <w:t>A</w:t>
             </w:r>
           </w:p>
         </w:tc>
@@ -28579,7 +28579,7 @@
               <w:jc w:val="center"/>
             </w:pPr>
             <w:r>
-              <w:t>R</w:t>
+              <w:t>A</w:t>
             </w:r>
           </w:p>
         </w:tc>
@@ -29347,7 +29347,7 @@
               <w:jc w:val="center"/>
             </w:pPr>
             <w:r>
-              <w:t>R</w:t>
+              <w:t>A</w:t>
             </w:r>
           </w:p>
         </w:tc>
@@ -29614,7 +29614,7 @@
     </w:p>
     <w:p>
       <w:r>
-        <w:pict w14:anchorId="0C46728C">
+        <w:pict w14:anchorId="2B27354F">
           <v:rect id="Horizontal Line 4" o:spid="_x0000_s1031" alt="" style="width:468pt;height:.05pt;visibility:visible;mso-wrap-style:square;mso-width-percent:0;mso-height-percent:0;mso-left-percent:-10001;mso-top-percent:-10001;mso-position-horizontal:absolute;mso-position-horizontal-relative:char;mso-position-vertical:absolute;mso-position-vertical-relative:line;mso-width-percent:0;mso-height-percent:0;mso-left-percent:-10001;mso-top-percent:-10001;v-text-anchor:top" filled="f">
             <o:lock v:ext="edit" rotation="t" aspectratio="t" verticies="t" text="t" shapetype="t"/>
             <w10:anchorlock/>
@@ -30552,7 +30552,7 @@
               <w:jc w:val="center"/>
             </w:pPr>
             <w:r>
-              <w:t>R</w:t>
+              <w:t>A</w:t>
             </w:r>
           </w:p>
         </w:tc>
@@ -31163,7 +31163,7 @@
               <w:jc w:val="center"/>
             </w:pPr>
             <w:r>
-              <w:t>R</w:t>
+              <w:t>A</w:t>
             </w:r>
           </w:p>
         </w:tc>
@@ -31682,7 +31682,7 @@
               <w:jc w:val="center"/>
             </w:pPr>
             <w:r>
-              <w:t>R</w:t>
+              <w:t>A</w:t>
             </w:r>
           </w:p>
         </w:tc>
@@ -32215,7 +32215,7 @@
               <w:jc w:val="center"/>
             </w:pPr>
             <w:r>
-              <w:t>R</w:t>
+              <w:t>A</w:t>
             </w:r>
           </w:p>
         </w:tc>
@@ -32748,7 +32748,7 @@
               <w:jc w:val="center"/>
             </w:pPr>
             <w:r>
-              <w:t>R</w:t>
+              <w:t>A</w:t>
             </w:r>
           </w:p>
         </w:tc>
@@ -33250,7 +33250,7 @@
               <w:jc w:val="center"/>
             </w:pPr>
             <w:r>
-              <w:t>R</w:t>
+              <w:t>A</w:t>
             </w:r>
           </w:p>
         </w:tc>
@@ -33776,7 +33776,7 @@
               <w:jc w:val="center"/>
             </w:pPr>
             <w:r>
-              <w:t>R</w:t>
+              <w:t>A</w:t>
             </w:r>
           </w:p>
         </w:tc>
@@ -34351,7 +34351,7 @@
               <w:jc w:val="center"/>
             </w:pPr>
             <w:r>
-              <w:t>R</w:t>
+              <w:t>A</w:t>
             </w:r>
           </w:p>
         </w:tc>
@@ -34856,7 +34856,7 @@
               <w:jc w:val="center"/>
             </w:pPr>
             <w:r>
-              <w:t>R</w:t>
+              <w:t>A</w:t>
             </w:r>
           </w:p>
         </w:tc>
@@ -35184,8 +35184,8 @@
       <w:bookmarkStart w:id="221" w:name="_9.5_Verification_Phase"/>
       <w:bookmarkStart w:id="222" w:name="_9.4.11_Fuzz_Testing"/>
       <w:bookmarkStart w:id="223" w:name="avcdl-fuzz-testing-avcdl-verification-1"/>
-      <w:bookmarkStart w:id="224" w:name="avcdl-verification-phase"/>
-      <w:bookmarkStart w:id="225" w:name="_Toc229046592"/>
+      <w:bookmarkStart w:id="224" w:name="_Toc229046592"/>
+      <w:bookmarkStart w:id="225" w:name="avcdl-verification-phase"/>
       <w:bookmarkEnd w:id="218"/>
       <w:bookmarkEnd w:id="219"/>
       <w:bookmarkEnd w:id="220"/>
@@ -35211,7 +35211,7 @@
         <w:t>]</w:t>
       </w:r>
       <w:bookmarkEnd w:id="223"/>
-      <w:bookmarkEnd w:id="225"/>
+      <w:bookmarkEnd w:id="224"/>
     </w:p>
     <w:p>
       <w:pPr>
@@ -35410,7 +35410,7 @@
               <w:jc w:val="center"/>
             </w:pPr>
             <w:r>
-              <w:t>R</w:t>
+              <w:t>A</w:t>
             </w:r>
           </w:p>
         </w:tc>
@@ -36012,7 +36012,7 @@
               <w:jc w:val="center"/>
             </w:pPr>
             <w:r>
-              <w:t>R</w:t>
+              <w:t>A</w:t>
             </w:r>
           </w:p>
         </w:tc>
@@ -36368,7 +36368,7 @@
       <w:r>
         <w:t>Verification Phase</w:t>
       </w:r>
-      <w:bookmarkEnd w:id="224"/>
+      <w:bookmarkEnd w:id="225"/>
       <w:bookmarkEnd w:id="230"/>
     </w:p>
     <w:p>
@@ -36407,7 +36407,7 @@
     </w:p>
     <w:p>
       <w:r>
-        <w:pict w14:anchorId="748E4650">
+        <w:pict w14:anchorId="0C4C8241">
           <v:rect id="Horizontal Line 5" o:spid="_x0000_s1030" alt="" style="width:468pt;height:.05pt;visibility:visible;mso-wrap-style:square;mso-width-percent:0;mso-height-percent:0;mso-left-percent:-10001;mso-top-percent:-10001;mso-position-horizontal:absolute;mso-position-horizontal-relative:char;mso-position-vertical:absolute;mso-position-vertical-relative:line;mso-width-percent:0;mso-height-percent:0;mso-left-percent:-10001;mso-top-percent:-10001;v-text-anchor:top" filled="f">
             <o:lock v:ext="edit" rotation="t" aspectratio="t" verticies="t" text="t" shapetype="t"/>
             <w10:anchorlock/>
@@ -37055,7 +37055,7 @@
               <w:jc w:val="center"/>
             </w:pPr>
             <w:r>
-              <w:t>R</w:t>
+              <w:t>A</w:t>
             </w:r>
           </w:p>
         </w:tc>
@@ -37725,7 +37725,7 @@
               <w:jc w:val="center"/>
             </w:pPr>
             <w:r>
-              <w:t>R</w:t>
+              <w:t>A</w:t>
             </w:r>
           </w:p>
         </w:tc>
@@ -38273,7 +38273,7 @@
               <w:jc w:val="center"/>
             </w:pPr>
             <w:r>
-              <w:t>R</w:t>
+              <w:t>A</w:t>
             </w:r>
           </w:p>
         </w:tc>
@@ -38872,7 +38872,7 @@
               <w:jc w:val="center"/>
             </w:pPr>
             <w:r>
-              <w:t>R</w:t>
+              <w:t>A</w:t>
             </w:r>
           </w:p>
         </w:tc>
@@ -39224,7 +39224,7 @@
     </w:p>
     <w:p>
       <w:r>
-        <w:pict w14:anchorId="53BCFD82">
+        <w:pict w14:anchorId="155541E2">
           <v:rect id="Horizontal Line 6" o:spid="_x0000_s1029" alt="" style="width:468pt;height:.05pt;visibility:visible;mso-wrap-style:square;mso-width-percent:0;mso-height-percent:0;mso-left-percent:-10001;mso-top-percent:-10001;mso-position-horizontal:absolute;mso-position-horizontal-relative:char;mso-position-vertical:absolute;mso-position-vertical-relative:line;mso-width-percent:0;mso-height-percent:0;mso-left-percent:-10001;mso-top-percent:-10001;v-text-anchor:top" filled="f">
             <o:lock v:ext="edit" rotation="t" aspectratio="t" verticies="t" text="t" shapetype="t"/>
             <w10:anchorlock/>
@@ -39691,7 +39691,7 @@
               <w:jc w:val="center"/>
             </w:pPr>
             <w:r>
-              <w:t>R</w:t>
+              <w:t>A</w:t>
             </w:r>
           </w:p>
         </w:tc>
@@ -40298,7 +40298,7 @@
               <w:jc w:val="center"/>
             </w:pPr>
             <w:r>
-              <w:t>R</w:t>
+              <w:t>A</w:t>
             </w:r>
           </w:p>
         </w:tc>
@@ -41002,7 +41002,7 @@
               <w:jc w:val="center"/>
             </w:pPr>
             <w:r>
-              <w:t>R</w:t>
+              <w:t>A</w:t>
             </w:r>
           </w:p>
         </w:tc>
@@ -41215,7 +41215,7 @@
     </w:p>
     <w:p>
       <w:r>
-        <w:pict w14:anchorId="4A1FA217">
+        <w:pict w14:anchorId="1C4976BC">
           <v:rect id="Horizontal Line 7" o:spid="_x0000_s1028" alt="" style="width:468pt;height:.05pt;visibility:visible;mso-wrap-style:square;mso-width-percent:0;mso-height-percent:0;mso-left-percent:-10001;mso-top-percent:-10001;mso-position-horizontal:absolute;mso-position-horizontal-relative:char;mso-position-vertical:absolute;mso-position-vertical-relative:line;mso-width-percent:0;mso-height-percent:0;mso-left-percent:-10001;mso-top-percent:-10001;v-text-anchor:top" filled="f">
             <o:lock v:ext="edit" rotation="t" aspectratio="t" verticies="t" text="t" shapetype="t"/>
             <w10:anchorlock/>
@@ -41735,7 +41735,7 @@
               <w:jc w:val="center"/>
             </w:pPr>
             <w:r>
-              <w:t>R</w:t>
+              <w:t>A</w:t>
             </w:r>
           </w:p>
         </w:tc>
@@ -42310,7 +42310,7 @@
               <w:jc w:val="center"/>
             </w:pPr>
             <w:r>
-              <w:t>R</w:t>
+              <w:t>A</w:t>
             </w:r>
           </w:p>
         </w:tc>
@@ -42774,7 +42774,7 @@
               <w:jc w:val="center"/>
             </w:pPr>
             <w:r>
-              <w:t>R</w:t>
+              <w:t>A</w:t>
             </w:r>
           </w:p>
         </w:tc>
@@ -43310,7 +43310,7 @@
               <w:jc w:val="center"/>
             </w:pPr>
             <w:r>
-              <w:t>R</w:t>
+              <w:t>A</w:t>
             </w:r>
           </w:p>
         </w:tc>
@@ -43694,7 +43694,7 @@
     </w:p>
     <w:p>
       <w:r>
-        <w:pict w14:anchorId="69B30BEB">
+        <w:pict w14:anchorId="11F2654A">
           <v:rect id="Horizontal Line 8" o:spid="_x0000_s1027" alt="" style="width:468pt;height:.05pt;visibility:visible;mso-wrap-style:square;mso-width-percent:0;mso-height-percent:0;mso-left-percent:-10001;mso-top-percent:-10001;mso-position-horizontal:absolute;mso-position-horizontal-relative:char;mso-position-vertical:absolute;mso-position-vertical-relative:line;mso-width-percent:0;mso-height-percent:0;mso-left-percent:-10001;mso-top-percent:-10001;v-text-anchor:top" filled="f">
             <o:lock v:ext="edit" rotation="t" aspectratio="t" verticies="t" text="t" shapetype="t"/>
             <w10:anchorlock/>
@@ -44062,7 +44062,7 @@
               <w:jc w:val="center"/>
             </w:pPr>
             <w:r>
-              <w:t>R</w:t>
+              <w:t>A</w:t>
             </w:r>
           </w:p>
         </w:tc>
@@ -44378,7 +44378,7 @@
     </w:p>
     <w:p>
       <w:r>
-        <w:pict w14:anchorId="4CC75008">
+        <w:pict w14:anchorId="314D51DB">
           <v:rect id="Horizontal Line 9" o:spid="_x0000_s1026" alt="" style="width:468pt;height:.05pt;visibility:visible;mso-wrap-style:square;mso-width-percent:0;mso-height-percent:0;mso-left-percent:-10001;mso-top-percent:-10001;mso-position-horizontal:absolute;mso-position-horizontal-relative:char;mso-position-vertical:absolute;mso-position-vertical-relative:line;mso-width-percent:0;mso-height-percent:0;mso-left-percent:-10001;mso-top-percent:-10001;v-text-anchor:top" filled="f">
             <o:lock v:ext="edit" rotation="t" aspectratio="t" verticies="t" text="t" shapetype="t"/>
             <w10:anchorlock/>
@@ -44793,7 +44793,7 @@
               <w:jc w:val="center"/>
             </w:pPr>
             <w:r>
-              <w:t>R</w:t>
+              <w:t>A</w:t>
             </w:r>
           </w:p>
         </w:tc>
@@ -45240,7 +45240,7 @@
               <w:jc w:val="center"/>
             </w:pPr>
             <w:r>
-              <w:t>R</w:t>
+              <w:t>A</w:t>
             </w:r>
           </w:p>
         </w:tc>
@@ -45730,7 +45730,7 @@
               <w:jc w:val="center"/>
             </w:pPr>
             <w:r>
-              <w:t>R</w:t>
+              <w:t>A</w:t>
             </w:r>
           </w:p>
         </w:tc>

</xml_diff>

<commit_message>
Updated AVCDL primary document and AVCDL roles and responsibilities spreadsheet (corrected multiple RACI inconsistencies)
</commit_message>
<xml_diff>
--- a/source/primary_document/AVCDL.docx
+++ b/source/primary_document/AVCDL.docx
@@ -83,7 +83,7 @@
           <w:rFonts w:cs="Arial"/>
           <w:szCs w:val="22"/>
         </w:rPr>
-        <w:t>8</w:t>
+        <w:t>9</w:t>
       </w:r>
     </w:p>
     <w:p>
@@ -120,7 +120,7 @@
           <w:noProof/>
           <w:szCs w:val="22"/>
         </w:rPr>
-        <w:t>5/8/26 8:17 AM</w:t>
+        <w:t>7/2/26 12:10 PM</w:t>
       </w:r>
       <w:r>
         <w:rPr>
@@ -18267,7 +18267,7 @@
     </w:p>
     <w:p>
       <w:r>
-        <w:pict w14:anchorId="46CD391F">
+        <w:pict w14:anchorId="6E105C1E">
           <v:rect id="Horizontal Line 1" o:spid="_x0000_s1034" alt="" style="width:468pt;height:.05pt;visibility:visible;mso-wrap-style:square;mso-width-percent:0;mso-height-percent:0;mso-left-percent:-10001;mso-top-percent:-10001;mso-position-horizontal:absolute;mso-position-horizontal-relative:char;mso-position-vertical:absolute;mso-position-vertical-relative:line;mso-width-percent:0;mso-height-percent:0;mso-left-percent:-10001;mso-top-percent:-10001;v-text-anchor:top" filled="f">
             <o:lock v:ext="edit" rotation="t" aspectratio="t" verticies="t" text="t" shapetype="t"/>
             <w10:anchorlock/>
@@ -22786,7 +22786,7 @@
               <w:jc w:val="center"/>
             </w:pPr>
             <w:r>
-              <w:t>-</w:t>
+              <w:t>R</w:t>
             </w:r>
           </w:p>
         </w:tc>
@@ -24969,7 +24969,7 @@
     </w:p>
     <w:p>
       <w:r>
-        <w:pict w14:anchorId="2E2784BE">
+        <w:pict w14:anchorId="158EDDF9">
           <v:rect id="Horizontal Line 2" o:spid="_x0000_s1033" alt="" style="width:468pt;height:.05pt;visibility:visible;mso-wrap-style:square;mso-width-percent:0;mso-height-percent:0;mso-left-percent:-10001;mso-top-percent:-10001;mso-position-horizontal:absolute;mso-position-horizontal-relative:char;mso-position-vertical:absolute;mso-position-vertical-relative:line;mso-width-percent:0;mso-height-percent:0;mso-left-percent:-10001;mso-top-percent:-10001;v-text-anchor:top" filled="f">
             <o:lock v:ext="edit" rotation="t" aspectratio="t" verticies="t" text="t" shapetype="t"/>
             <w10:anchorlock/>
@@ -25426,7 +25426,7 @@
               <w:jc w:val="center"/>
             </w:pPr>
             <w:r>
-              <w:t>I</w:t>
+              <w:t>C</w:t>
             </w:r>
           </w:p>
         </w:tc>
@@ -26250,7 +26250,7 @@
     </w:p>
     <w:p>
       <w:r>
-        <w:pict w14:anchorId="75816764">
+        <w:pict w14:anchorId="06D75BE1">
           <v:rect id="Horizontal Line 3" o:spid="_x0000_s1032" alt="" style="width:468pt;height:.05pt;visibility:visible;mso-wrap-style:square;mso-width-percent:0;mso-height-percent:0;mso-left-percent:-10001;mso-top-percent:-10001;mso-position-horizontal:absolute;mso-position-horizontal-relative:char;mso-position-vertical:absolute;mso-position-vertical-relative:line;mso-width-percent:0;mso-height-percent:0;mso-left-percent:-10001;mso-top-percent:-10001;v-text-anchor:top" filled="f">
             <o:lock v:ext="edit" rotation="t" aspectratio="t" verticies="t" text="t" shapetype="t"/>
             <w10:anchorlock/>
@@ -29614,7 +29614,7 @@
     </w:p>
     <w:p>
       <w:r>
-        <w:pict w14:anchorId="2B27354F">
+        <w:pict w14:anchorId="6291EE0D">
           <v:rect id="Horizontal Line 4" o:spid="_x0000_s1031" alt="" style="width:468pt;height:.05pt;visibility:visible;mso-wrap-style:square;mso-width-percent:0;mso-height-percent:0;mso-left-percent:-10001;mso-top-percent:-10001;mso-position-horizontal:absolute;mso-position-horizontal-relative:char;mso-position-vertical:absolute;mso-position-vertical-relative:line;mso-width-percent:0;mso-height-percent:0;mso-left-percent:-10001;mso-top-percent:-10001;v-text-anchor:top" filled="f">
             <o:lock v:ext="edit" rotation="t" aspectratio="t" verticies="t" text="t" shapetype="t"/>
             <w10:anchorlock/>
@@ -33236,7 +33236,7 @@
               <w:jc w:val="center"/>
             </w:pPr>
             <w:r>
-              <w:t>-</w:t>
+              <w:t>R</w:t>
             </w:r>
           </w:p>
         </w:tc>
@@ -34337,7 +34337,7 @@
               <w:jc w:val="center"/>
             </w:pPr>
             <w:r>
-              <w:t>-</w:t>
+              <w:t>R</w:t>
             </w:r>
           </w:p>
         </w:tc>
@@ -35424,7 +35424,7 @@
               <w:jc w:val="center"/>
             </w:pPr>
             <w:r>
-              <w:t>C</w:t>
+              <w:t>R</w:t>
             </w:r>
           </w:p>
         </w:tc>
@@ -36407,7 +36407,7 @@
     </w:p>
     <w:p>
       <w:r>
-        <w:pict w14:anchorId="0C4C8241">
+        <w:pict w14:anchorId="20244062">
           <v:rect id="Horizontal Line 5" o:spid="_x0000_s1030" alt="" style="width:468pt;height:.05pt;visibility:visible;mso-wrap-style:square;mso-width-percent:0;mso-height-percent:0;mso-left-percent:-10001;mso-top-percent:-10001;mso-position-horizontal:absolute;mso-position-horizontal-relative:char;mso-position-vertical:absolute;mso-position-vertical-relative:line;mso-width-percent:0;mso-height-percent:0;mso-left-percent:-10001;mso-top-percent:-10001;v-text-anchor:top" filled="f">
             <o:lock v:ext="edit" rotation="t" aspectratio="t" verticies="t" text="t" shapetype="t"/>
             <w10:anchorlock/>
@@ -39224,7 +39224,7 @@
     </w:p>
     <w:p>
       <w:r>
-        <w:pict w14:anchorId="155541E2">
+        <w:pict w14:anchorId="3DEC9661">
           <v:rect id="Horizontal Line 6" o:spid="_x0000_s1029" alt="" style="width:468pt;height:.05pt;visibility:visible;mso-wrap-style:square;mso-width-percent:0;mso-height-percent:0;mso-left-percent:-10001;mso-top-percent:-10001;mso-position-horizontal:absolute;mso-position-horizontal-relative:char;mso-position-vertical:absolute;mso-position-vertical-relative:line;mso-width-percent:0;mso-height-percent:0;mso-left-percent:-10001;mso-top-percent:-10001;v-text-anchor:top" filled="f">
             <o:lock v:ext="edit" rotation="t" aspectratio="t" verticies="t" text="t" shapetype="t"/>
             <w10:anchorlock/>
@@ -41215,7 +41215,7 @@
     </w:p>
     <w:p>
       <w:r>
-        <w:pict w14:anchorId="1C4976BC">
+        <w:pict w14:anchorId="15119335">
           <v:rect id="Horizontal Line 7" o:spid="_x0000_s1028" alt="" style="width:468pt;height:.05pt;visibility:visible;mso-wrap-style:square;mso-width-percent:0;mso-height-percent:0;mso-left-percent:-10001;mso-top-percent:-10001;mso-position-horizontal:absolute;mso-position-horizontal-relative:char;mso-position-vertical:absolute;mso-position-vertical-relative:line;mso-width-percent:0;mso-height-percent:0;mso-left-percent:-10001;mso-top-percent:-10001;v-text-anchor:top" filled="f">
             <o:lock v:ext="edit" rotation="t" aspectratio="t" verticies="t" text="t" shapetype="t"/>
             <w10:anchorlock/>
@@ -43694,7 +43694,7 @@
     </w:p>
     <w:p>
       <w:r>
-        <w:pict w14:anchorId="11F2654A">
+        <w:pict w14:anchorId="4A8067B3">
           <v:rect id="Horizontal Line 8" o:spid="_x0000_s1027" alt="" style="width:468pt;height:.05pt;visibility:visible;mso-wrap-style:square;mso-width-percent:0;mso-height-percent:0;mso-left-percent:-10001;mso-top-percent:-10001;mso-position-horizontal:absolute;mso-position-horizontal-relative:char;mso-position-vertical:absolute;mso-position-vertical-relative:line;mso-width-percent:0;mso-height-percent:0;mso-left-percent:-10001;mso-top-percent:-10001;v-text-anchor:top" filled="f">
             <o:lock v:ext="edit" rotation="t" aspectratio="t" verticies="t" text="t" shapetype="t"/>
             <w10:anchorlock/>
@@ -44378,7 +44378,7 @@
     </w:p>
     <w:p>
       <w:r>
-        <w:pict w14:anchorId="314D51DB">
+        <w:pict w14:anchorId="36E1DF7E">
           <v:rect id="Horizontal Line 9" o:spid="_x0000_s1026" alt="" style="width:468pt;height:.05pt;visibility:visible;mso-wrap-style:square;mso-width-percent:0;mso-height-percent:0;mso-left-percent:-10001;mso-top-percent:-10001;mso-position-horizontal:absolute;mso-position-horizontal-relative:char;mso-position-vertical:absolute;mso-position-vertical-relative:line;mso-width-percent:0;mso-height-percent:0;mso-left-percent:-10001;mso-top-percent:-10001;v-text-anchor:top" filled="f">
             <o:lock v:ext="edit" rotation="t" aspectratio="t" verticies="t" text="t" shapetype="t"/>
             <w10:anchorlock/>

</xml_diff>